<commit_message>
Update arb docx content for 2026-08-03 release
</commit_message>
<xml_diff>
--- a/eng/docx/08.content.docx
+++ b/eng/docx/08.content.docx
@@ -185,7 +185,7 @@
         <w:rPr>
           <w:lang w:val="en_US" w:bidi="en_US"/>
         </w:rPr>
-        <w:t>Ruth 1:1</w:t>
+        <w:t>Ruth 1:1 (#1)</w:t>
       </w:r>
       <w:r>
         <w:rPr>
@@ -311,7 +311,7 @@
         <w:rPr>
           <w:lang w:val="en_US" w:bidi="en_US"/>
         </w:rPr>
-        <w:t>Ruth 1:3</w:t>
+        <w:t>Ruth 1:3 (#1)</w:t>
       </w:r>
       <w:r>
         <w:rPr>
@@ -374,7 +374,7 @@
         <w:rPr>
           <w:lang w:val="en_US" w:bidi="en_US"/>
         </w:rPr>
-        <w:t>Ruth 1:5</w:t>
+        <w:t>Ruth 1:5 (#1)</w:t>
       </w:r>
       <w:r>
         <w:rPr>
@@ -437,7 +437,7 @@
         <w:rPr>
           <w:lang w:val="en_US" w:bidi="en_US"/>
         </w:rPr>
-        <w:t>Ruth 1:6</w:t>
+        <w:t>Ruth 1:6 (#1)</w:t>
       </w:r>
       <w:r>
         <w:rPr>
@@ -500,7 +500,7 @@
         <w:rPr>
           <w:lang w:val="en_US" w:bidi="en_US"/>
         </w:rPr>
-        <w:t>Ruth 1:8</w:t>
+        <w:t>Ruth 1:8 (#1)</w:t>
       </w:r>
       <w:r>
         <w:rPr>
@@ -563,7 +563,7 @@
         <w:rPr>
           <w:lang w:val="en_US" w:bidi="en_US"/>
         </w:rPr>
-        <w:t>Ruth 1:9</w:t>
+        <w:t>Ruth 1:9 (#1)</w:t>
       </w:r>
       <w:r>
         <w:rPr>
@@ -626,7 +626,7 @@
         <w:rPr>
           <w:lang w:val="en_US" w:bidi="en_US"/>
         </w:rPr>
-        <w:t>Ruth 1:13</w:t>
+        <w:t>Ruth 1:13 (#1)</w:t>
       </w:r>
       <w:r>
         <w:rPr>
@@ -689,7 +689,7 @@
         <w:rPr>
           <w:lang w:val="en_US" w:bidi="en_US"/>
         </w:rPr>
-        <w:t>Ruth 1:16</w:t>
+        <w:t>Ruth 1:16 (#1)</w:t>
       </w:r>
       <w:r>
         <w:rPr>
@@ -752,7 +752,7 @@
         <w:rPr>
           <w:lang w:val="en_US" w:bidi="en_US"/>
         </w:rPr>
-        <w:t>Ruth 1:17</w:t>
+        <w:t>Ruth 1:17 (#1)</w:t>
       </w:r>
       <w:r>
         <w:rPr>
@@ -786,7 +786,7 @@
         <w:rPr>
           <w:lang w:val="en_US" w:bidi="en_US"/>
         </w:rPr>
-        <w:t>She said she would remain with Naomi until they died. She said, "In the place where you die, I will die, and there I will be buried. May Yahweh do thus to me, and thus may he add, if death separates between me and between you."</w:t>
+        <w:t>She said she would remain with Naomi until they died. She said, “In the place where you die, I will die, and there I will be buried. May Yahweh do thus to me, and thus may he add, if death separates between me and between you.”</w:t>
       </w:r>
       <w:r>
         <w:rPr>
@@ -815,7 +815,7 @@
         <w:rPr>
           <w:lang w:val="en_US" w:bidi="en_US"/>
         </w:rPr>
-        <w:t>Ruth 1:19</w:t>
+        <w:t>Ruth 1:19 (#1)</w:t>
       </w:r>
       <w:r>
         <w:rPr>
@@ -878,7 +878,7 @@
         <w:rPr>
           <w:lang w:val="en_US" w:bidi="en_US"/>
         </w:rPr>
-        <w:t>Ruth 1:20</w:t>
+        <w:t>Ruth 1:20 (#1)</w:t>
       </w:r>
       <w:r>
         <w:rPr>
@@ -941,7 +941,7 @@
         <w:rPr>
           <w:lang w:val="en_US" w:bidi="en_US"/>
         </w:rPr>
-        <w:t>Ruth 1:22</w:t>
+        <w:t>Ruth 1:22 (#1)</w:t>
       </w:r>
       <w:r>
         <w:rPr>
@@ -1004,7 +1004,7 @@
         <w:rPr>
           <w:lang w:val="en_US" w:bidi="en_US"/>
         </w:rPr>
-        <w:t>Ruth 2:1</w:t>
+        <w:t>Ruth 2:1 (#1)</w:t>
       </w:r>
       <w:r>
         <w:rPr>
@@ -1067,7 +1067,7 @@
         <w:rPr>
           <w:lang w:val="en_US" w:bidi="en_US"/>
         </w:rPr>
-        <w:t>Ruth 2:2</w:t>
+        <w:t>Ruth 2:2 (#1)</w:t>
       </w:r>
       <w:r>
         <w:rPr>
@@ -1130,7 +1130,7 @@
         <w:rPr>
           <w:lang w:val="en_US" w:bidi="en_US"/>
         </w:rPr>
-        <w:t>Ruth 2:4</w:t>
+        <w:t>Ruth 2:4 (#1)</w:t>
       </w:r>
       <w:r>
         <w:rPr>
@@ -1193,7 +1193,7 @@
         <w:rPr>
           <w:lang w:val="en_US" w:bidi="en_US"/>
         </w:rPr>
-        <w:t>Ruth 2:5</w:t>
+        <w:t>Ruth 2:5 (#1)</w:t>
       </w:r>
       <w:r>
         <w:rPr>
@@ -1256,7 +1256,7 @@
         <w:rPr>
           <w:lang w:val="en_US" w:bidi="en_US"/>
         </w:rPr>
-        <w:t>Ruth 2:8</w:t>
+        <w:t>Ruth 2:8 (#1)</w:t>
       </w:r>
       <w:r>
         <w:rPr>
@@ -1319,7 +1319,7 @@
         <w:rPr>
           <w:lang w:val="en_US" w:bidi="en_US"/>
         </w:rPr>
-        <w:t>Ruth 2:10</w:t>
+        <w:t>Ruth 2:10 (#1)</w:t>
       </w:r>
       <w:r>
         <w:rPr>
@@ -1382,7 +1382,7 @@
         <w:rPr>
           <w:lang w:val="en_US" w:bidi="en_US"/>
         </w:rPr>
-        <w:t>Ruth 2:11</w:t>
+        <w:t>Ruth 2:11 (#1)</w:t>
       </w:r>
       <w:r>
         <w:rPr>
@@ -1445,7 +1445,7 @@
         <w:rPr>
           <w:lang w:val="en_US" w:bidi="en_US"/>
         </w:rPr>
-        <w:t>Ruth 2:12</w:t>
+        <w:t>Ruth 2:12 (#1)</w:t>
       </w:r>
       <w:r>
         <w:rPr>
@@ -1508,7 +1508,7 @@
         <w:rPr>
           <w:lang w:val="en_US" w:bidi="en_US"/>
         </w:rPr>
-        <w:t>Ruth 2:15</w:t>
+        <w:t>Ruth 2:15 (#1)</w:t>
       </w:r>
       <w:r>
         <w:rPr>
@@ -1571,7 +1571,7 @@
         <w:rPr>
           <w:lang w:val="en_US" w:bidi="en_US"/>
         </w:rPr>
-        <w:t>Ruth 2:16</w:t>
+        <w:t>Ruth 2:16 (#1)</w:t>
       </w:r>
       <w:r>
         <w:rPr>
@@ -1634,7 +1634,7 @@
         <w:rPr>
           <w:lang w:val="en_US" w:bidi="en_US"/>
         </w:rPr>
-        <w:t>Ruth 2:19</w:t>
+        <w:t>Ruth 2:19 (#1)</w:t>
       </w:r>
       <w:r>
         <w:rPr>
@@ -1697,7 +1697,7 @@
         <w:rPr>
           <w:lang w:val="en_US" w:bidi="en_US"/>
         </w:rPr>
-        <w:t>Ruth 2:20</w:t>
+        <w:t>Ruth 2:20 (#1)</w:t>
       </w:r>
       <w:r>
         <w:rPr>
@@ -1731,7 +1731,7 @@
         <w:rPr>
           <w:lang w:val="en_US" w:bidi="en_US"/>
         </w:rPr>
-        <w:t>She said, “May he be blessed by Yahweh”</w:t>
+        <w:t>She said, “May he be blessed by Yahweh.”</w:t>
       </w:r>
       <w:r>
         <w:rPr>
@@ -1760,7 +1760,7 @@
         <w:rPr>
           <w:lang w:val="en_US" w:bidi="en_US"/>
         </w:rPr>
-        <w:t>Ruth 2:22</w:t>
+        <w:t>Ruth 2:22 (#1)</w:t>
       </w:r>
       <w:r>
         <w:rPr>
@@ -1823,7 +1823,7 @@
         <w:rPr>
           <w:lang w:val="en_US" w:bidi="en_US"/>
         </w:rPr>
-        <w:t>Ruth 2:23</w:t>
+        <w:t>Ruth 2:23 (#1)</w:t>
       </w:r>
       <w:r>
         <w:rPr>
@@ -1886,7 +1886,7 @@
         <w:rPr>
           <w:lang w:val="en_US" w:bidi="en_US"/>
         </w:rPr>
-        <w:t>Ruth 3:1</w:t>
+        <w:t>Ruth 3:1 (#1)</w:t>
       </w:r>
       <w:r>
         <w:rPr>
@@ -1949,7 +1949,7 @@
         <w:rPr>
           <w:lang w:val="en_US" w:bidi="en_US"/>
         </w:rPr>
-        <w:t>Ruth 3:3</w:t>
+        <w:t>Ruth 3:3 (#1)</w:t>
       </w:r>
       <w:r>
         <w:rPr>
@@ -2012,7 +2012,7 @@
         <w:rPr>
           <w:lang w:val="en_US" w:bidi="en_US"/>
         </w:rPr>
-        <w:t>Ruth 3:4</w:t>
+        <w:t>Ruth 3:4 (#1)</w:t>
       </w:r>
       <w:r>
         <w:rPr>
@@ -2075,7 +2075,7 @@
         <w:rPr>
           <w:lang w:val="en_US" w:bidi="en_US"/>
         </w:rPr>
-        <w:t>Ruth 3:5</w:t>
+        <w:t>Ruth 3:5 (#1)</w:t>
       </w:r>
       <w:r>
         <w:rPr>
@@ -2138,7 +2138,7 @@
         <w:rPr>
           <w:lang w:val="en_US" w:bidi="en_US"/>
         </w:rPr>
-        <w:t>Ruth 3:8</w:t>
+        <w:t>Ruth 3:8 (#1)</w:t>
       </w:r>
       <w:r>
         <w:rPr>
@@ -2201,7 +2201,7 @@
         <w:rPr>
           <w:lang w:val="en_US" w:bidi="en_US"/>
         </w:rPr>
-        <w:t>Ruth 3:9</w:t>
+        <w:t>Ruth 3:9 (#1)</w:t>
       </w:r>
       <w:r>
         <w:rPr>
@@ -2264,7 +2264,7 @@
         <w:rPr>
           <w:lang w:val="en_US" w:bidi="en_US"/>
         </w:rPr>
-        <w:t>Ruth 3:10</w:t>
+        <w:t>Ruth 3:10 (#1)</w:t>
       </w:r>
       <w:r>
         <w:rPr>
@@ -2327,7 +2327,7 @@
         <w:rPr>
           <w:lang w:val="en_US" w:bidi="en_US"/>
         </w:rPr>
-        <w:t>Ruth 3:11</w:t>
+        <w:t>Ruth 3:11 (#1)</w:t>
       </w:r>
       <w:r>
         <w:rPr>
@@ -2390,7 +2390,7 @@
         <w:rPr>
           <w:lang w:val="en_US" w:bidi="en_US"/>
         </w:rPr>
-        <w:t>Ruth 3:12</w:t>
+        <w:t>Ruth 3:12 (#1)</w:t>
       </w:r>
       <w:r>
         <w:rPr>
@@ -2453,7 +2453,7 @@
         <w:rPr>
           <w:lang w:val="en_US" w:bidi="en_US"/>
         </w:rPr>
-        <w:t>Ruth 3:13</w:t>
+        <w:t>Ruth 3:13 (#1)</w:t>
       </w:r>
       <w:r>
         <w:rPr>
@@ -2516,7 +2516,7 @@
         <w:rPr>
           <w:lang w:val="en_US" w:bidi="en_US"/>
         </w:rPr>
-        <w:t>Ruth 3:14</w:t>
+        <w:t>Ruth 3:14 (#1)</w:t>
       </w:r>
       <w:r>
         <w:rPr>
@@ -2579,7 +2579,7 @@
         <w:rPr>
           <w:lang w:val="en_US" w:bidi="en_US"/>
         </w:rPr>
-        <w:t>Ruth 3:15</w:t>
+        <w:t>Ruth 3:15 (#1)</w:t>
       </w:r>
       <w:r>
         <w:rPr>
@@ -2642,7 +2642,7 @@
         <w:rPr>
           <w:lang w:val="en_US" w:bidi="en_US"/>
         </w:rPr>
-        <w:t>Ruth 3:18</w:t>
+        <w:t>Ruth 3:18 (#1)</w:t>
       </w:r>
       <w:r>
         <w:rPr>
@@ -2705,7 +2705,7 @@
         <w:rPr>
           <w:lang w:val="en_US" w:bidi="en_US"/>
         </w:rPr>
-        <w:t>Ruth 4:1</w:t>
+        <w:t>Ruth 4:1 (#1)</w:t>
       </w:r>
       <w:r>
         <w:rPr>
@@ -2768,7 +2768,7 @@
         <w:rPr>
           <w:lang w:val="en_US" w:bidi="en_US"/>
         </w:rPr>
-        <w:t>Ruth 4:2</w:t>
+        <w:t>Ruth 4:2 (#1)</w:t>
       </w:r>
       <w:r>
         <w:rPr>
@@ -2831,7 +2831,7 @@
         <w:rPr>
           <w:lang w:val="en_US" w:bidi="en_US"/>
         </w:rPr>
-        <w:t>Ruth 4:3</w:t>
+        <w:t>Ruth 4:3 (#1)</w:t>
       </w:r>
       <w:r>
         <w:rPr>
@@ -2894,7 +2894,7 @@
         <w:rPr>
           <w:lang w:val="en_US" w:bidi="en_US"/>
         </w:rPr>
-        <w:t>Ruth 4:4</w:t>
+        <w:t>Ruth 4:4 (#1)</w:t>
       </w:r>
       <w:r>
         <w:rPr>
@@ -3020,7 +3020,7 @@
         <w:rPr>
           <w:lang w:val="en_US" w:bidi="en_US"/>
         </w:rPr>
-        <w:t>Ruth 4:5</w:t>
+        <w:t>Ruth 4:5 (#1)</w:t>
       </w:r>
       <w:r>
         <w:rPr>
@@ -3083,7 +3083,7 @@
         <w:rPr>
           <w:lang w:val="en_US" w:bidi="en_US"/>
         </w:rPr>
-        <w:t>Ruth 4:6</w:t>
+        <w:t>Ruth 4:6 (#1)</w:t>
       </w:r>
       <w:r>
         <w:rPr>
@@ -3209,7 +3209,7 @@
         <w:rPr>
           <w:lang w:val="en_US" w:bidi="en_US"/>
         </w:rPr>
-        <w:t>Ruth 4:8</w:t>
+        <w:t>Ruth 4:8 (#1)</w:t>
       </w:r>
       <w:r>
         <w:rPr>
@@ -3272,7 +3272,7 @@
         <w:rPr>
           <w:lang w:val="en_US" w:bidi="en_US"/>
         </w:rPr>
-        <w:t>Ruth 4:9</w:t>
+        <w:t>Ruth 4:9 (#1)</w:t>
       </w:r>
       <w:r>
         <w:rPr>
@@ -3335,7 +3335,7 @@
         <w:rPr>
           <w:lang w:val="en_US" w:bidi="en_US"/>
         </w:rPr>
-        <w:t>Ruth 4:10</w:t>
+        <w:t>Ruth 4:10 (#1)</w:t>
       </w:r>
       <w:r>
         <w:rPr>
@@ -3398,7 +3398,7 @@
         <w:rPr>
           <w:lang w:val="en_US" w:bidi="en_US"/>
         </w:rPr>
-        <w:t>Ruth 4:12</w:t>
+        <w:t>Ruth 4:12 (#1)</w:t>
       </w:r>
       <w:r>
         <w:rPr>
@@ -3461,7 +3461,7 @@
         <w:rPr>
           <w:lang w:val="en_US" w:bidi="en_US"/>
         </w:rPr>
-        <w:t>Ruth 4:15</w:t>
+        <w:t>Ruth 4:15 (#1)</w:t>
       </w:r>
       <w:r>
         <w:rPr>
@@ -3495,7 +3495,7 @@
         <w:rPr>
           <w:lang w:val="en_US" w:bidi="en_US"/>
         </w:rPr>
-        <w:t>They said this because of Ruth's love for Naomi, and because Ruth had given birth to a grandson for Naomi.</w:t>
+        <w:t>They said this because of Ruth’s love for Naomi, and because Ruth had given birth to a grandson for Naomi.</w:t>
       </w:r>
       <w:r>
         <w:rPr>
@@ -3524,7 +3524,7 @@
         <w:rPr>
           <w:lang w:val="en_US" w:bidi="en_US"/>
         </w:rPr>
-        <w:t>Ruth 4:16</w:t>
+        <w:t>Ruth 4:16 (#1)</w:t>
       </w:r>
       <w:r>
         <w:rPr>
@@ -3587,7 +3587,7 @@
         <w:rPr>
           <w:lang w:val="en_US" w:bidi="en_US"/>
         </w:rPr>
-        <w:t>Ruth 4:17</w:t>
+        <w:t>Ruth 4:17 (#1)</w:t>
       </w:r>
       <w:r>
         <w:rPr>

</xml_diff>